<commit_message>
Making the prawn plot line clearer
</commit_message>
<xml_diff>
--- a/Chapter 1 - Prawns.docx
+++ b/Chapter 1 - Prawns.docx
@@ -170,26 +170,11 @@
     <w:p>
       <w:r>
         <w:br/>
-        <w:t>And if Jackie</w:t>
-      </w:r>
-      <w:r>
-        <w:t xml:space="preserve"> was doing this</w:t>
-      </w:r>
-      <w:r>
-        <w:t xml:space="preserve"> </w:t>
-      </w:r>
-      <w:r>
-        <w:t xml:space="preserve">while half-way through consuming a meal deal, Klee often found himself leaning back against the passenger window and watching as crumbs of half-eaten prawn-cocktail crisps rain like snow on the trousers of his </w:t>
-      </w:r>
-      <w:proofErr w:type="gramStart"/>
-      <w:r>
-        <w:t>of</w:t>
-      </w:r>
-      <w:r>
-        <w:t>f</w:t>
-      </w:r>
-      <w:r>
-        <w:t xml:space="preserve"> the peg</w:t>
+        <w:t xml:space="preserve">And if Jackie was doing this while half-way through consuming a meal deal, Klee often found himself leaning back against the passenger window and watching as crumbs of half-eaten prawn-cocktail crisps rain like snow on the trousers of his </w:t>
+      </w:r>
+      <w:proofErr w:type="gramStart"/>
+      <w:r>
+        <w:t>off the peg</w:t>
       </w:r>
       <w:proofErr w:type="gramEnd"/>
       <w:r>
@@ -411,28 +396,31 @@
     <w:p/>
     <w:p>
       <w:r>
-        <w:t xml:space="preserve">Most of detection work wasn’t deduction. Some of </w:t>
-      </w:r>
-      <w:r>
-        <w:t xml:space="preserve">it </w:t>
-      </w:r>
-      <w:r>
-        <w:t xml:space="preserve">was. </w:t>
-      </w:r>
-    </w:p>
-    <w:p/>
-    <w:p>
-      <w:r>
-        <w:t xml:space="preserve">Most of it wasn’t. </w:t>
-      </w:r>
-    </w:p>
-    <w:p/>
-    <w:p>
-      <w:r>
-        <w:t xml:space="preserve">Inductive reasoning. </w:t>
-      </w:r>
-      <w:r>
-        <w:t xml:space="preserve">In the past Gobby Geoff goes round his </w:t>
+        <w:t>Although the cos players with the deerstalker wanted to believe detective work was about deduction, most of it wasn’t</w:t>
+      </w:r>
+      <w:r>
+        <w:t xml:space="preserve">. </w:t>
+      </w:r>
+    </w:p>
+    <w:p/>
+    <w:p>
+      <w:r>
+        <w:t>Inductive reasoning</w:t>
+      </w:r>
+      <w:r>
+        <w:t xml:space="preserve"> was a lot of it</w:t>
+      </w:r>
+      <w:r>
+        <w:t xml:space="preserve">. </w:t>
+      </w:r>
+    </w:p>
+    <w:p/>
+    <w:p>
+      <w:r>
+        <w:t>Let’s say that i</w:t>
+      </w:r>
+      <w:r>
+        <w:t xml:space="preserve">n the past Gobby Geoff goes round his </w:t>
       </w:r>
       <w:proofErr w:type="gramStart"/>
       <w:r>
@@ -440,7 +428,13 @@
       </w:r>
       <w:proofErr w:type="gramEnd"/>
       <w:r>
-        <w:t xml:space="preserve"> in High Barnet for a shag after a successful bank </w:t>
+        <w:t xml:space="preserve"> in High Barnet for a shag</w:t>
+      </w:r>
+      <w:r>
+        <w:t xml:space="preserve"> whenever he’s done a</w:t>
+      </w:r>
+      <w:r>
+        <w:t xml:space="preserve"> successful bank </w:t>
       </w:r>
       <w:proofErr w:type="gramStart"/>
       <w:r>
@@ -448,13 +442,183 @@
       </w:r>
       <w:proofErr w:type="gramEnd"/>
       <w:r>
-        <w:t xml:space="preserve"> goes straight home to his Missus in East Finchley if it didn’t work out. That’s the kind of reasoning that will send coppers running to High Barnet if it looks like Gobby Geoff on the CCTV and  </w:t>
-      </w:r>
-    </w:p>
-    <w:p/>
-    <w:p>
-      <w:r>
-        <w:t xml:space="preserve">Analogical reasoning. The wonderfully named, abductive reasoning. And the awful, awful feeling hovering somewhere in your bowels that you’d missed </w:t>
+        <w:t xml:space="preserve"> goes straight home to his </w:t>
+      </w:r>
+      <w:r>
+        <w:t>m</w:t>
+      </w:r>
+      <w:r>
+        <w:t>issus in East Finchley if</w:t>
+      </w:r>
+      <w:r>
+        <w:t xml:space="preserve"> there was a problem and</w:t>
+      </w:r>
+      <w:r>
+        <w:t xml:space="preserve"> didn’t work out. That’s the kind of </w:t>
+      </w:r>
+      <w:proofErr w:type="gramStart"/>
+      <w:r>
+        <w:t>reasoning</w:t>
+      </w:r>
+      <w:proofErr w:type="gramEnd"/>
+      <w:r>
+        <w:t xml:space="preserve"> that will send coppers running to High Barnet if it looks like Gobby Geoff on </w:t>
+      </w:r>
+      <w:proofErr w:type="gramStart"/>
+      <w:r>
+        <w:t>the CCTV</w:t>
+      </w:r>
+      <w:proofErr w:type="gramEnd"/>
+      <w:r>
+        <w:t xml:space="preserve"> and </w:t>
+      </w:r>
+      <w:r>
+        <w:t>there’s thirty to forty K missing.</w:t>
+      </w:r>
+      <w:r>
+        <w:t xml:space="preserve"> </w:t>
+      </w:r>
+    </w:p>
+    <w:p/>
+    <w:p>
+      <w:r>
+        <w:t>Analogical reasoning</w:t>
+      </w:r>
+      <w:r>
+        <w:t>, there was some that</w:t>
+      </w:r>
+      <w:r>
+        <w:t xml:space="preserve">. </w:t>
+      </w:r>
+      <w:r>
+        <w:t xml:space="preserve">You know if there’s something annoying on the </w:t>
+      </w:r>
+      <w:proofErr w:type="spellStart"/>
+      <w:r>
+        <w:t>telly</w:t>
+      </w:r>
+      <w:proofErr w:type="spellEnd"/>
+      <w:r>
+        <w:t>? Something too loud, that stops you from thinking? Well</w:t>
+      </w:r>
+      <w:r>
+        <w:t xml:space="preserve"> then,</w:t>
+      </w:r>
+      <w:r>
+        <w:t xml:space="preserve"> you turn the </w:t>
+      </w:r>
+      <w:proofErr w:type="spellStart"/>
+      <w:r>
+        <w:t>telly</w:t>
+      </w:r>
+      <w:proofErr w:type="spellEnd"/>
+      <w:r>
+        <w:t xml:space="preserve"> off. </w:t>
+      </w:r>
+      <w:r>
+        <w:br/>
+      </w:r>
+      <w:r>
+        <w:br/>
+      </w:r>
+      <w:r>
+        <w:t>The</w:t>
+      </w:r>
+      <w:r>
+        <w:t>re</w:t>
+      </w:r>
+      <w:r>
+        <w:t xml:space="preserve"> was this bloke in</w:t>
+      </w:r>
+      <w:r>
+        <w:t xml:space="preserve"> Wood Green. Kept doing the same </w:t>
+      </w:r>
+      <w:proofErr w:type="gramStart"/>
+      <w:r>
+        <w:t>to</w:t>
+      </w:r>
+      <w:proofErr w:type="gramEnd"/>
+      <w:r>
+        <w:t xml:space="preserve"> his noisy </w:t>
+      </w:r>
+      <w:proofErr w:type="spellStart"/>
+      <w:r>
+        <w:t>neighbours</w:t>
+      </w:r>
+      <w:proofErr w:type="spellEnd"/>
+      <w:r>
+        <w:t xml:space="preserve">. To be fair he’d asked them nicely. Once. Which is kind of where the analogy breaks down. You don’t politely ask your </w:t>
+      </w:r>
+      <w:proofErr w:type="spellStart"/>
+      <w:r>
+        <w:t>telly</w:t>
+      </w:r>
+      <w:proofErr w:type="spellEnd"/>
+      <w:r>
+        <w:t xml:space="preserve"> to keep the noise to a low roar.</w:t>
+      </w:r>
+      <w:r>
+        <w:t xml:space="preserve"> </w:t>
+      </w:r>
+      <w:r>
+        <w:br/>
+      </w:r>
+      <w:r>
+        <w:br/>
+        <w:t xml:space="preserve">But if the </w:t>
+      </w:r>
+      <w:proofErr w:type="spellStart"/>
+      <w:r>
+        <w:t>neighbours</w:t>
+      </w:r>
+      <w:proofErr w:type="spellEnd"/>
+      <w:r>
+        <w:t xml:space="preserve"> did it again. He’d turn them off. Not with a remote control. With a hammer. Thing is he had a job mowing the lawn in a graveyard, and that meant he not only, literally knew where the </w:t>
+      </w:r>
+      <w:r>
+        <w:lastRenderedPageBreak/>
+        <w:t>bodies were buried, he knew where they kept the mini digger that they used to bury</w:t>
+      </w:r>
+      <w:r>
+        <w:rPr>
+          <w:lang w:val="en-GB"/>
+        </w:rPr>
+        <w:t xml:space="preserve"> them</w:t>
+      </w:r>
+      <w:r>
+        <w:t>.</w:t>
+      </w:r>
+      <w:r>
+        <w:br/>
+      </w:r>
+      <w:r>
+        <w:br/>
+        <w:t xml:space="preserve">Ironically, it was a complaint from the </w:t>
+      </w:r>
+      <w:proofErr w:type="spellStart"/>
+      <w:r>
+        <w:t>neighbours</w:t>
+      </w:r>
+      <w:proofErr w:type="spellEnd"/>
+      <w:r>
+        <w:t xml:space="preserve">, in the houses next to the graveyard who, legitimately, expected that the graveyard should be a quiet place, that was his undoing. </w:t>
+      </w:r>
+    </w:p>
+    <w:p/>
+    <w:p>
+      <w:r>
+        <w:t xml:space="preserve">Most of the reasoning that Klee did, he thought, was with his intestines. It </w:t>
+      </w:r>
+      <w:proofErr w:type="gramStart"/>
+      <w:r>
+        <w:t>was keeping</w:t>
+      </w:r>
+      <w:proofErr w:type="gramEnd"/>
+      <w:r>
+        <w:t xml:space="preserve"> turning over something over, often in the middle of the night, because of </w:t>
+      </w:r>
+      <w:r>
+        <w:t xml:space="preserve">the awful, awful feeling hovering somewhere in your bowels that you’d missed </w:t>
       </w:r>
       <w:proofErr w:type="gramStart"/>
       <w:r>
@@ -464,12 +628,18 @@
       <w:r>
         <w:t xml:space="preserve"> cocked something up. That was most of detective work.</w:t>
       </w:r>
+      <w:r>
+        <w:t xml:space="preserve"> What would you call that? Dyspeptic reasoning? Colonic reasoning. </w:t>
+      </w:r>
     </w:p>
     <w:p/>
     <w:p>
       <w:r>
         <w:t>But this? This was straight forward deduction.</w:t>
       </w:r>
+      <w:r>
+        <w:t xml:space="preserve"> Klee thought that anyway.</w:t>
+      </w:r>
     </w:p>
     <w:p/>
     <w:p>
@@ -488,104 +658,451 @@
     </w:p>
     <w:p/>
     <w:p>
-      <w:proofErr w:type="gramStart"/>
+      <w:r>
+        <w:t xml:space="preserve">Jackie Spanner hated the cold. </w:t>
+      </w:r>
+      <w:r>
+        <w:t>So</w:t>
+      </w:r>
+      <w:r>
+        <w:t>,</w:t>
+      </w:r>
+      <w:r>
+        <w:t xml:space="preserve"> the thing that Jackie Spanner absolutely did not do was walk out onto an icy patio barefoot in only a half-length satin dressing gown (it was his wife</w:t>
+      </w:r>
+      <w:r>
+        <w:t>’</w:t>
+      </w:r>
+      <w:r>
+        <w:t>s).</w:t>
+      </w:r>
+    </w:p>
+    <w:p/>
+    <w:p>
+      <w:r>
+        <w:t xml:space="preserve">What Jackie Spanner did not do was </w:t>
+      </w:r>
+      <w:proofErr w:type="gramStart"/>
+      <w:r>
+        <w:t>sit himself</w:t>
+      </w:r>
+      <w:proofErr w:type="gramEnd"/>
+      <w:r>
+        <w:t xml:space="preserve"> down in a lawn chair at 2:40 in the morning. And shoot himself in the face with a shotgun</w:t>
+      </w:r>
+      <w:r>
+        <w:t>.</w:t>
+      </w:r>
+      <w:r>
+        <w:t xml:space="preserve"> And that night it was 5 degrees.</w:t>
+      </w:r>
+    </w:p>
+    <w:p/>
+    <w:p>
+      <w:r>
+        <w:t xml:space="preserve">And even if he did. And he didn’t, but even if he did. What Jackie Spanner </w:t>
+      </w:r>
+      <w:proofErr w:type="gramStart"/>
+      <w:r>
+        <w:t>definitely didn’t</w:t>
+      </w:r>
+      <w:proofErr w:type="gramEnd"/>
+      <w:r>
+        <w:t xml:space="preserve"> do was tidy up after himself. </w:t>
+      </w:r>
+      <w:r>
+        <w:t xml:space="preserve">He didn’t </w:t>
+      </w:r>
+      <w:r>
+        <w:t>put the shot gun gently and neatly down on a picnic table, six feet away from his now bloody and lifeless body.</w:t>
+      </w:r>
+      <w:r>
+        <w:t xml:space="preserve"> Because if Jackie Spanner hadn’t tidied up after himself when he was alive, he certainly wasn’t going to do it after he was dead.</w:t>
+      </w:r>
+      <w:r>
+        <w:br/>
+      </w:r>
+    </w:p>
+    <w:p>
+      <w:r>
+        <w:t>But Jackie Spanner hated villains. And here’s what</w:t>
+      </w:r>
+      <w:r>
+        <w:t xml:space="preserve"> Jackie</w:t>
+      </w:r>
+      <w:r>
+        <w:t xml:space="preserve"> S</w:t>
+      </w:r>
+      <w:r>
+        <w:t xml:space="preserve">panner </w:t>
+      </w:r>
+      <w:proofErr w:type="gramStart"/>
+      <w:r>
+        <w:t>had done</w:t>
+      </w:r>
+      <w:proofErr w:type="gramEnd"/>
+      <w:r>
+        <w:t>. Just a couple of hours before he was involved in this semi-naked charade on his frost-covered patio, was text Ernesto Klee.</w:t>
+      </w:r>
+      <w:r>
+        <w:br/>
+      </w:r>
+      <w:r>
+        <w:br/>
+        <w:t>“I had an idea</w:t>
+      </w:r>
+      <w:proofErr w:type="gramStart"/>
+      <w:r>
+        <w:t>.</w:t>
+      </w:r>
+      <w:proofErr w:type="gramEnd"/>
+      <w:r>
+        <w:t xml:space="preserve"> Made some enquiries and I think it checks out.</w:t>
+      </w:r>
+      <w:r>
+        <w:t xml:space="preserve"> The call’s coming from inside the house.</w:t>
+      </w:r>
+      <w:r>
+        <w:t xml:space="preserve"> We’re nearly there</w:t>
+      </w:r>
+      <w:r>
+        <w:t>, Ernie</w:t>
+      </w:r>
+      <w:r>
+        <w:t>. Talk to you tomorrow.”</w:t>
+      </w:r>
+    </w:p>
+    <w:p/>
+    <w:p>
+      <w:r>
+        <w:t xml:space="preserve">Do you know a thing that Jackie Spanner loved? Horror movies. </w:t>
+      </w:r>
+      <w:proofErr w:type="gramStart"/>
+      <w:r>
+        <w:t>Actually, probably</w:t>
+      </w:r>
+      <w:proofErr w:type="gramEnd"/>
+      <w:r>
+        <w:t xml:space="preserve"> the thing Jackie Spanner loved more than anything else was relating the plot of horror movies to his stakeout partner at 3am while eating prawn cocktail crisps. </w:t>
+      </w:r>
+      <w:r>
+        <w:br/>
+      </w:r>
+      <w:r>
+        <w:br/>
+      </w:r>
+      <w:r>
+        <w:t>D</w:t>
+      </w:r>
+      <w:r>
+        <w:t>o you know the kind of villains</w:t>
+      </w:r>
+      <w:r>
+        <w:t xml:space="preserve"> Jackie Spanner</w:t>
+      </w:r>
+      <w:r>
+        <w:t xml:space="preserve"> hated the most? The ones that were hiding among the ranks of his own police force. </w:t>
+      </w:r>
+    </w:p>
+    <w:p/>
+    <w:p>
+      <w:r>
+        <w:t>Jackie had been told many times to stop investigating the death of Aimee Finch.</w:t>
+      </w:r>
+      <w:r>
+        <w:t xml:space="preserve"> A journalist who</w:t>
+      </w:r>
+      <w:r>
+        <w:t xml:space="preserve"> had been beaten to death by someone, just out of camera shot, in the car park of the Greenhouse pub in Muswell Hill. Jackie hadn’t listened. </w:t>
+      </w:r>
+      <w:r>
+        <w:br/>
+      </w:r>
+      <w:r>
+        <w:br/>
+        <w:t>The idea that, on the night when he finally thought he’d got to the bottom of what happened, and who had killed her, he would waltz barefoot into the night in inappropriate nightwear was laughable. The idea that, after shooting himself, he’d tidy up, was about as likely as him doing it if he’d still been alive.</w:t>
+      </w:r>
+    </w:p>
+    <w:p/>
+    <w:p>
       <w:r>
         <w:lastRenderedPageBreak/>
-        <w:t>So</w:t>
-      </w:r>
-      <w:proofErr w:type="gramEnd"/>
-      <w:r>
-        <w:t xml:space="preserve"> the thing that Jackie Spanner absolutely did not do was walk out onto an icy patio barefoot in only a half-length satin dressing gown (it was his </w:t>
+        <w:t xml:space="preserve">So, deduction told Klee that Jackie Spanner hadn’t killed himself, and so it didn’t require genius level deduction to go one step further and </w:t>
       </w:r>
       <w:proofErr w:type="spellStart"/>
       <w:r>
-        <w:t>wifes</w:t>
+        <w:t>realise</w:t>
       </w:r>
       <w:proofErr w:type="spellEnd"/>
       <w:r>
-        <w:t>).</w:t>
-      </w:r>
-    </w:p>
-    <w:p/>
-    <w:p>
-      <w:r>
-        <w:t xml:space="preserve">What Jackie Spanner did not do was sit </w:t>
+        <w:t xml:space="preserve"> that meant that someone else had shot him.</w:t>
+      </w:r>
+    </w:p>
+    <w:p/>
+    <w:p>
+      <w:r>
+        <w:t>But are you sure about this Klee? It sounds great as a theory. But does it really hang together</w:t>
+      </w:r>
+      <w:r>
+        <w:t xml:space="preserve">? What about abductive logic? What’s abductive logic? Abductive logic is horses not zebras. You </w:t>
+      </w:r>
+      <w:proofErr w:type="gramStart"/>
+      <w:r>
+        <w:t>hear the sound of</w:t>
+      </w:r>
+      <w:proofErr w:type="gramEnd"/>
+      <w:r>
+        <w:t xml:space="preserve"> </w:t>
       </w:r>
       <w:proofErr w:type="spellStart"/>
-      <w:proofErr w:type="gramStart"/>
-      <w:r>
-        <w:t>him self</w:t>
+      <w:r>
+        <w:t>clippity</w:t>
       </w:r>
       <w:proofErr w:type="spellEnd"/>
-      <w:proofErr w:type="gramEnd"/>
-      <w:r>
-        <w:t xml:space="preserve"> down in a lawn chair at 2:40 in the morning. And shoot himself in the face with a shotgun.</w:t>
-      </w:r>
-    </w:p>
-    <w:p/>
-    <w:p>
-      <w:r>
-        <w:t xml:space="preserve">And even if he did. And he didn’t, but even if he did. What Jackie Spanner </w:t>
-      </w:r>
-      <w:proofErr w:type="gramStart"/>
-      <w:r>
-        <w:t>definitely didn’t</w:t>
-      </w:r>
-      <w:proofErr w:type="gramEnd"/>
-      <w:r>
-        <w:t xml:space="preserve"> do was tidy up after himself. And put the shot gun gently and neatly down on a picnic table, six feet away from his now bloody and lifeless body.</w:t>
-      </w:r>
-      <w:r>
-        <w:br/>
-      </w:r>
-    </w:p>
-    <w:p>
-      <w:r>
-        <w:t xml:space="preserve">What Jackie </w:t>
-      </w:r>
-      <w:proofErr w:type="gramStart"/>
-      <w:r>
-        <w:t>spanner</w:t>
-      </w:r>
-      <w:proofErr w:type="gramEnd"/>
-      <w:r>
-        <w:t xml:space="preserve"> had done. Just a couple of hours before he was involved in this semi-naked charade on his frost-covered patio, was text Ernesto Klee.</w:t>
-      </w:r>
-      <w:r>
-        <w:br/>
-      </w:r>
-      <w:r>
-        <w:br/>
-        <w:t>“I had an idea</w:t>
-      </w:r>
-      <w:proofErr w:type="gramStart"/>
+      <w:r>
+        <w:t xml:space="preserve"> clop</w:t>
+      </w:r>
+      <w:r>
+        <w:t>,</w:t>
+      </w:r>
+      <w:r>
+        <w:t xml:space="preserve"> many</w:t>
+      </w:r>
+      <w:r>
+        <w:t>, multiple,</w:t>
+      </w:r>
+      <w:r>
+        <w:t xml:space="preserve"> </w:t>
+      </w:r>
+      <w:proofErr w:type="spellStart"/>
+      <w:r>
+        <w:t>clippity</w:t>
+      </w:r>
+      <w:proofErr w:type="spellEnd"/>
+      <w:r>
+        <w:t xml:space="preserve"> clops</w:t>
+      </w:r>
+      <w:r>
+        <w:t>? That’s probably horses.</w:t>
+      </w:r>
+      <w:r>
+        <w:t xml:space="preserve"> It’s very unlikely to be zebras.</w:t>
+      </w:r>
+      <w:r>
+        <w:t xml:space="preserve">  </w:t>
+      </w:r>
+      <w:r>
+        <w:br/>
+      </w:r>
+      <w:r>
+        <w:br/>
+        <w:t>Jackie’s wife left him. Why did she leave him? Because he couldn’t let go o</w:t>
+      </w:r>
+      <w:r>
+        <w:t>f</w:t>
+      </w:r>
+      <w:r>
+        <w:t xml:space="preserve"> his crazy theories</w:t>
+      </w:r>
+      <w:r>
+        <w:t xml:space="preserve"> on the Aimee murder</w:t>
+      </w:r>
+      <w:r>
+        <w:t>. Jackie was in a deranged state.</w:t>
+      </w:r>
+      <w:r>
+        <w:t xml:space="preserve"> He’d just been suspended.</w:t>
+      </w:r>
+      <w:r>
+        <w:t xml:space="preserve"> Evidence for this? He was wearing his wife’s dressing gown!</w:t>
+      </w:r>
+      <w:r>
+        <w:t xml:space="preserve"> And sitting in the garden at 2am!</w:t>
+      </w:r>
+    </w:p>
+    <w:p/>
+    <w:p>
+      <w:r>
+        <w:t>OK, Jackie didn’t put the gun down nice</w:t>
+      </w:r>
+      <w:r>
+        <w:t>ly</w:t>
+      </w:r>
+      <w:r>
+        <w:t xml:space="preserve"> and neatly two to three </w:t>
+      </w:r>
+      <w:proofErr w:type="spellStart"/>
+      <w:r>
+        <w:t>metres</w:t>
+      </w:r>
+      <w:proofErr w:type="spellEnd"/>
+      <w:r>
+        <w:t xml:space="preserve"> from the body. But who was first on the scene? The </w:t>
+      </w:r>
+      <w:proofErr w:type="spellStart"/>
+      <w:r>
+        <w:t>neighbour</w:t>
+      </w:r>
+      <w:proofErr w:type="spellEnd"/>
+      <w:r>
+        <w:t xml:space="preserve"> who heard the shots. Then the first copper on the scene </w:t>
+      </w:r>
+      <w:r>
+        <w:t xml:space="preserve">was a sprog who </w:t>
+      </w:r>
+      <w:r>
+        <w:t xml:space="preserve">had been out of Hendon just a few weeks. If either of them had moved the gun, then realized that was a bad idea and wiped </w:t>
+      </w:r>
+      <w:proofErr w:type="gramStart"/>
+      <w:r>
+        <w:t>it</w:t>
+      </w:r>
+      <w:proofErr w:type="gramEnd"/>
+      <w:r>
+        <w:t xml:space="preserve"> of prints, do you think they’d own up to it?</w:t>
+      </w:r>
+    </w:p>
+    <w:p/>
+    <w:p>
+      <w:r>
+        <w:t xml:space="preserve">Horses Klee, not zebras and </w:t>
+      </w:r>
+      <w:proofErr w:type="gramStart"/>
+      <w:r>
+        <w:t>definitely not</w:t>
+      </w:r>
+      <w:proofErr w:type="gramEnd"/>
+      <w:r>
+        <w:t xml:space="preserve"> a herd of satyrs or unicorns. </w:t>
+      </w:r>
+    </w:p>
+    <w:p/>
+    <w:p>
+      <w:r>
+        <w:t xml:space="preserve">But here’s why Klee was </w:t>
+      </w:r>
+      <w:proofErr w:type="gramStart"/>
+      <w:r>
+        <w:t>absolutely certain</w:t>
+      </w:r>
+      <w:proofErr w:type="gramEnd"/>
+      <w:r>
+        <w:t xml:space="preserve"> that the “simplest” explanation wasn’t the right one. Here’s </w:t>
+      </w:r>
+      <w:r>
+        <w:t xml:space="preserve">why Klee was </w:t>
+      </w:r>
+      <w:proofErr w:type="gramStart"/>
+      <w:r>
+        <w:t>absolutely sure</w:t>
+      </w:r>
+      <w:proofErr w:type="gramEnd"/>
+      <w:r>
+        <w:t xml:space="preserve"> that the evidence surrounding Jackie Spanner’s death indicated, </w:t>
+      </w:r>
+      <w:r>
+        <w:t xml:space="preserve">not horses, not zebras, </w:t>
+      </w:r>
+      <w:r>
+        <w:t xml:space="preserve">not unicorns, and not satyrs, but something far less mythical, bent Met coppers trying to cover their </w:t>
+      </w:r>
+      <w:proofErr w:type="spellStart"/>
+      <w:r>
+        <w:t>arse</w:t>
+      </w:r>
+      <w:proofErr w:type="spellEnd"/>
       <w:r>
         <w:t>.</w:t>
       </w:r>
-      <w:proofErr w:type="gramEnd"/>
-      <w:r>
-        <w:t xml:space="preserve"> Made some enquiries and I think it checks out. We’re nearly there. Talk to you tomorrow.”</w:t>
-      </w:r>
-    </w:p>
-    <w:p/>
-    <w:p>
-      <w:r>
-        <w:t xml:space="preserve">Jackie Spanner hated villains. And do you know the kind of villains he hated the most? The ones that were hiding among the ranks of his own police force. </w:t>
-      </w:r>
-    </w:p>
-    <w:p/>
-    <w:p>
-      <w:r>
-        <w:t xml:space="preserve">Jackie had been told many times to stop investigating the death of Aimee Finch. Who had been beaten to death by someone, just out of camera shot, in the car park of the Greenhouse pub in Muswell Hill. Jackie hadn’t listened. </w:t>
-      </w:r>
-      <w:r>
-        <w:br/>
-      </w:r>
-      <w:r>
-        <w:br/>
-        <w:t>The idea that, on the night when he finally thought he’d got to the bottom of what happened, and who had killed her, he would waltz barefoot into the night in inappropriate nightwear was laughable. The idea that, after shooting himself, he’d tidy up, was about as likely as him doing it if he’d still been alive.</w:t>
-      </w:r>
-    </w:p>
+    </w:p>
+    <w:p/>
+    <w:p>
+      <w:r>
+        <w:t xml:space="preserve">At 11:29 on the night of his death, Jackie Spanner phones the Crytal Palace Tandoori and Grill. Since his wife had left, he’d done this most nights. This, he knew was the absolute latest point at which Mohammed </w:t>
+      </w:r>
+      <w:r>
+        <w:t>Hossain</w:t>
+      </w:r>
+      <w:r>
+        <w:t xml:space="preserve">, owner of the CPTG would take his order, and that he’d get the delivery just after midnight. And </w:t>
+      </w:r>
+      <w:proofErr w:type="spellStart"/>
+      <w:r>
+        <w:t>Mr</w:t>
+      </w:r>
+      <w:proofErr w:type="spellEnd"/>
+      <w:r>
+        <w:t xml:space="preserve"> </w:t>
+      </w:r>
+      <w:r>
+        <w:t>Hossain</w:t>
+      </w:r>
+      <w:r>
+        <w:t xml:space="preserve">, delivered the order himself. He’d got into the habit of doing it on his way home. He chatted to Jackie for a few moments. </w:t>
+      </w:r>
+    </w:p>
+    <w:p/>
+    <w:p>
+      <w:r>
+        <w:t xml:space="preserve">What had Jackie ordered? What had </w:t>
+      </w:r>
+      <w:proofErr w:type="spellStart"/>
+      <w:r>
+        <w:t>Mr</w:t>
+      </w:r>
+      <w:proofErr w:type="spellEnd"/>
+      <w:r>
+        <w:t xml:space="preserve"> </w:t>
+      </w:r>
+      <w:r>
+        <w:t>Hossain</w:t>
+      </w:r>
+      <w:r>
+        <w:t xml:space="preserve"> delivered? A king prawn biriyani. </w:t>
+      </w:r>
+      <w:r>
+        <w:t xml:space="preserve">So, we’re back to deduction. </w:t>
+      </w:r>
+      <w:r>
+        <w:br/>
+      </w:r>
+      <w:r>
+        <w:br/>
+        <w:t xml:space="preserve">What did Jackie love more than anything else in the world, apart from his wife who’d left him and justice? Prawns. OK, Jackie might have lost his mind and started putting on his wife’s lingerie. OK, he might have decided that </w:t>
+      </w:r>
+      <w:proofErr w:type="gramStart"/>
+      <w:r>
+        <w:t>the suffering</w:t>
+      </w:r>
+      <w:proofErr w:type="gramEnd"/>
+      <w:r>
+        <w:t xml:space="preserve"> the cold was </w:t>
+      </w:r>
+      <w:proofErr w:type="gramStart"/>
+      <w:r>
+        <w:t>as</w:t>
+      </w:r>
+      <w:proofErr w:type="gramEnd"/>
+      <w:r>
+        <w:t xml:space="preserve"> nothing now he was saying goodbye to this cruel world. And yes, someone might have moved the gun. </w:t>
+      </w:r>
+    </w:p>
+    <w:p/>
+    <w:p>
+      <w:r>
+        <w:t xml:space="preserve">But one thing was </w:t>
+      </w:r>
+      <w:proofErr w:type="gramStart"/>
+      <w:r>
+        <w:t>absolutely certain</w:t>
+      </w:r>
+      <w:proofErr w:type="gramEnd"/>
+      <w:r>
+        <w:t>. If Jackie had decided to give himself a shove and shuffle himself off this mortal coil, he wouldn’t have done it before he’d eaten all his prawns.</w:t>
+      </w:r>
+    </w:p>
+    <w:p/>
+    <w:p/>
     <w:sectPr>
       <w:pgSz w:w="12240" w:h="15840"/>
       <w:pgMar w:top="1134" w:right="1134" w:bottom="1134" w:left="1134" w:header="0" w:footer="0" w:gutter="0"/>

</xml_diff>

<commit_message>
knocking this about a bit.
</commit_message>
<xml_diff>
--- a/Chapter 1 - Prawns.docx
+++ b/Chapter 1 - Prawns.docx
@@ -396,10 +396,7 @@
     <w:p/>
     <w:p>
       <w:r>
-        <w:t>Although the cos players with the deerstalker wanted to believe detective work was about deduction, most of it wasn’t</w:t>
-      </w:r>
-      <w:r>
-        <w:t xml:space="preserve">. </w:t>
+        <w:t xml:space="preserve">Although the cos players with the deerstalker wanted to believe detective work was about deduction, most of it wasn’t. </w:t>
       </w:r>
     </w:p>
     <w:p/>
@@ -615,10 +612,7 @@
       </w:r>
       <w:proofErr w:type="gramEnd"/>
       <w:r>
-        <w:t xml:space="preserve"> turning over something over, often in the middle of the night, because of </w:t>
-      </w:r>
-      <w:r>
-        <w:t xml:space="preserve">the awful, awful feeling hovering somewhere in your bowels that you’d missed </w:t>
+        <w:t xml:space="preserve"> turning over something over, often in the middle of the night, because of the awful, awful feeling hovering somewhere in your bowels that you’d missed </w:t>
       </w:r>
       <w:proofErr w:type="gramStart"/>
       <w:r>
@@ -626,10 +620,7 @@
       </w:r>
       <w:proofErr w:type="gramEnd"/>
       <w:r>
-        <w:t xml:space="preserve"> cocked something up. That was most of detective work.</w:t>
-      </w:r>
-      <w:r>
-        <w:t xml:space="preserve"> What would you call that? Dyspeptic reasoning? Colonic reasoning. </w:t>
+        <w:t xml:space="preserve"> cocked something up. That was most of detective work. What would you call that? Dyspeptic reasoning? Colonic reasoning. </w:t>
       </w:r>
     </w:p>
     <w:p/>
@@ -659,10 +650,7 @@
     <w:p/>
     <w:p>
       <w:r>
-        <w:t xml:space="preserve">Jackie Spanner hated the cold. </w:t>
-      </w:r>
-      <w:r>
-        <w:t>So</w:t>
+        <w:t>Jackie Spanner hated the cold. So</w:t>
       </w:r>
       <w:r>
         <w:t>,</w:t>
@@ -725,16 +713,7 @@
     </w:p>
     <w:p>
       <w:r>
-        <w:t>But Jackie Spanner hated villains. And here’s what</w:t>
-      </w:r>
-      <w:r>
-        <w:t xml:space="preserve"> Jackie</w:t>
-      </w:r>
-      <w:r>
-        <w:t xml:space="preserve"> S</w:t>
-      </w:r>
-      <w:r>
-        <w:t xml:space="preserve">panner </w:t>
+        <w:t xml:space="preserve">But Jackie Spanner hated villains. And here’s what Jackie Spanner </w:t>
       </w:r>
       <w:proofErr w:type="gramStart"/>
       <w:r>
@@ -795,13 +774,7 @@
         <w:t>D</w:t>
       </w:r>
       <w:r>
-        <w:t>o you know the kind of villains</w:t>
-      </w:r>
-      <w:r>
-        <w:t xml:space="preserve"> Jackie Spanner</w:t>
-      </w:r>
-      <w:r>
-        <w:t xml:space="preserve"> hated the most? The ones that were hiding among the ranks of his own police force. </w:t>
+        <w:t xml:space="preserve">o you know the kind of villains Jackie Spanner hated the most? The ones that were hiding among the ranks of his own police force. </w:t>
       </w:r>
     </w:p>
     <w:p/>
@@ -1068,15 +1041,13 @@
       </w:r>
       <w:r>
         <w:br/>
-        <w:t xml:space="preserve">What did Jackie love more than anything else in the world, apart from his wife who’d left him and justice? Prawns. OK, Jackie might have lost his mind and started putting on his wife’s lingerie. OK, he might have decided that </w:t>
-      </w:r>
-      <w:proofErr w:type="gramStart"/>
-      <w:r>
-        <w:t>the suffering</w:t>
-      </w:r>
-      <w:proofErr w:type="gramEnd"/>
-      <w:r>
-        <w:t xml:space="preserve"> the cold was </w:t>
+        <w:t>What did Jackie love more than anything else in the worl</w:t>
+      </w:r>
+      <w:r>
+        <w:t xml:space="preserve">d? More than anything in the world that was, </w:t>
+      </w:r>
+      <w:r>
+        <w:t xml:space="preserve">apart from his wife who’d left him and justice? Prawns. OK, Jackie might have lost his mind and started putting on his wife’s lingerie. OK, he might have decided that suffering the cold was </w:t>
       </w:r>
       <w:proofErr w:type="gramStart"/>
       <w:r>
@@ -1084,7 +1055,13 @@
       </w:r>
       <w:proofErr w:type="gramEnd"/>
       <w:r>
-        <w:t xml:space="preserve"> nothing now he was saying goodbye to this cruel world. And yes, someone might have moved the gun. </w:t>
+        <w:t xml:space="preserve"> nothing now he was saying goodbye to this cruel world. And yes, someone</w:t>
+      </w:r>
+      <w:r>
+        <w:t xml:space="preserve"> moron on probation</w:t>
+      </w:r>
+      <w:r>
+        <w:t xml:space="preserve"> might have moved the gun. </w:t>
       </w:r>
     </w:p>
     <w:p/>

</xml_diff>